<commit_message>
Portfolio: fuller first page (role, core-skills, overview table) + retitle 'Selected Work — A Snapshot' (curated sample framing)
</commit_message>
<xml_diff>
--- a/Ali-Shehroz-Previous-Work.docx
+++ b/Ali-Shehroz-Previous-Work.docx
@@ -2,13 +2,13 @@
 <file path=word/document.xml><?xml version="1.0" encoding="utf-8"?>
 <w:document xmlns:w="http://schemas.openxmlformats.org/wordprocessingml/2006/main" xmlns:m="http://schemas.openxmlformats.org/officeDocument/2006/math" xmlns:r="http://schemas.openxmlformats.org/officeDocument/2006/relationships" xmlns:o="urn:schemas-microsoft-com:office:office" xmlns:v="urn:schemas-microsoft-com:vml" xmlns:w10="urn:schemas-microsoft-com:office:word" xmlns:a="http://schemas.openxmlformats.org/drawingml/2006/main" xmlns:pic="http://schemas.openxmlformats.org/drawingml/2006/picture" xmlns:wp="http://schemas.openxmlformats.org/drawingml/2006/wordprocessingDrawing">
   <w:body>
-    <w:bookmarkStart w:id="32" w:name="previous-work-selected-projects"/>
+    <w:bookmarkStart w:id="32" w:name="selected-work-a-snapshot"/>
     <w:p>
       <w:pPr>
         <w:pStyle w:val="Heading1"/>
       </w:pPr>
       <w:r>
-        <w:t xml:space="preserve">Previous Work — Selected Projects</w:t>
+        <w:t xml:space="preserve">Selected Work — A Snapshot</w:t>
       </w:r>
     </w:p>
     <w:p>
@@ -26,19 +26,252 @@
         <w:t xml:space="preserve"> </w:t>
       </w:r>
       <w:r>
-        <w:t xml:space="preserve">· supplementary to the Adeeb Phase 1 Technical Assessment</w:t>
-      </w:r>
-    </w:p>
-    <w:p>
-      <w:pPr>
-        <w:pStyle w:val="BodyText"/>
-      </w:pPr>
+        <w:t xml:space="preserve">· Unity Developer</w:t>
+      </w:r>
+      <w:r>
+        <w:t xml:space="preserve"> </w:t>
+      </w:r>
       <w:r>
         <w:rPr>
           <w:i/>
           <w:iCs/>
         </w:rPr>
-        <w:t xml:space="preserve">A few relevant Unity projects that show my experience across the areas this assessment touches — WebGL + REST and the full Firebase platform — and beyond, into VR, hardware, and machine learning.</w:t>
+        <w:t xml:space="preserve">Supplementary to the Adeeb Phase 1 Technical Assessment</w:t>
+      </w:r>
+    </w:p>
+    <w:p>
+      <w:pPr>
+        <w:pStyle w:val="BodyText"/>
+      </w:pPr>
+      <w:r>
+        <w:t xml:space="preserve">These are</w:t>
+      </w:r>
+      <w:r>
+        <w:t xml:space="preserve"> </w:t>
+      </w:r>
+      <w:r>
+        <w:rPr>
+          <w:b/>
+          <w:bCs/>
+        </w:rPr>
+        <w:t xml:space="preserve">a few representative projects</w:t>
+      </w:r>
+      <w:r>
+        <w:t xml:space="preserve"> </w:t>
+      </w:r>
+      <w:r>
+        <w:t xml:space="preserve">— a sample to show the range I work across,</w:t>
+      </w:r>
+      <w:r>
+        <w:t xml:space="preserve"> </w:t>
+      </w:r>
+      <w:r>
+        <w:rPr>
+          <w:b/>
+          <w:bCs/>
+        </w:rPr>
+        <w:t xml:space="preserve">not a complete list</w:t>
+      </w:r>
+      <w:r>
+        <w:t xml:space="preserve">. Each is real, shipped or demoed work, with a live link or a narrated video walkthrough.</w:t>
+      </w:r>
+    </w:p>
+    <w:p>
+      <w:pPr>
+        <w:pStyle w:val="BodyText"/>
+      </w:pPr>
+      <w:r>
+        <w:rPr>
+          <w:b/>
+          <w:bCs/>
+        </w:rPr>
+        <w:t xml:space="preserve">Core skills shown here:</w:t>
+      </w:r>
+      <w:r>
+        <w:t xml:space="preserve"> </w:t>
+      </w:r>
+      <w:r>
+        <w:t xml:space="preserve">Unity · C# · WebGL builds &amp; templates · REST API integration (Newtonsoft JSON) · the full Firebase platform (Authentication · Realtime Database · Analytics · Cloud Functions) · VR interaction systems · Virtuix Omni hardware integration · Unity ML-Agents.</w:t>
+      </w:r>
+    </w:p>
+    <w:tbl>
+      <w:tblPr>
+        <w:tblStyle w:val="Table"/>
+        <w:tblW w:type="pct" w:w="5000"/>
+        <w:tblLayout w:type="fixed"/>
+        <w:tblLook w:firstRow="1" w:lastRow="0" w:firstColumn="0" w:lastColumn="0" w:noHBand="0" w:noVBand="0" w:val="0020"/>
+      </w:tblPr>
+      <w:tblGrid>
+        <w:gridCol w:w="2640"/>
+        <w:gridCol w:w="2640"/>
+        <w:gridCol w:w="2640"/>
+      </w:tblGrid>
+      <w:tr>
+        <w:trPr>
+          <w:tblHeader w:val="on"/>
+        </w:trPr>
+        <w:tc>
+          <w:tcPr/>
+          <w:p>
+            <w:pPr>
+              <w:pStyle w:val="Compact"/>
+            </w:pPr>
+            <w:r>
+              <w:t xml:space="preserve">Project</w:t>
+            </w:r>
+          </w:p>
+        </w:tc>
+        <w:tc>
+          <w:tcPr/>
+          <w:p>
+            <w:pPr>
+              <w:pStyle w:val="Compact"/>
+            </w:pPr>
+            <w:r>
+              <w:t xml:space="preserve">What it demonstrates</w:t>
+            </w:r>
+          </w:p>
+        </w:tc>
+        <w:tc>
+          <w:tcPr/>
+          <w:p>
+            <w:pPr>
+              <w:pStyle w:val="Compact"/>
+            </w:pPr>
+            <w:r>
+              <w:t xml:space="preserve">How to see it</w:t>
+            </w:r>
+          </w:p>
+        </w:tc>
+      </w:tr>
+      <w:tr>
+        <w:tc>
+          <w:tcPr/>
+          <w:p>
+            <w:pPr>
+              <w:pStyle w:val="Compact"/>
+            </w:pPr>
+            <w:r>
+              <w:rPr>
+                <w:b/>
+                <w:bCs/>
+              </w:rPr>
+              <w:t xml:space="preserve">GameBull</w:t>
+            </w:r>
+          </w:p>
+        </w:tc>
+        <w:tc>
+          <w:tcPr/>
+          <w:p>
+            <w:pPr>
+              <w:pStyle w:val="Compact"/>
+            </w:pPr>
+            <w:r>
+              <w:t xml:space="preserve">WebGL + REST at production scale</w:t>
+            </w:r>
+          </w:p>
+        </w:tc>
+        <w:tc>
+          <w:tcPr/>
+          <w:p>
+            <w:pPr>
+              <w:pStyle w:val="Compact"/>
+            </w:pPr>
+            <w:r>
+              <w:t xml:space="preserve">screenshots (below) · live on request</w:t>
+            </w:r>
+          </w:p>
+        </w:tc>
+      </w:tr>
+      <w:tr>
+        <w:tc>
+          <w:tcPr/>
+          <w:p>
+            <w:pPr>
+              <w:pStyle w:val="Compact"/>
+            </w:pPr>
+            <w:r>
+              <w:rPr>
+                <w:b/>
+                <w:bCs/>
+              </w:rPr>
+              <w:t xml:space="preserve">EmberBound</w:t>
+            </w:r>
+          </w:p>
+        </w:tc>
+        <w:tc>
+          <w:tcPr/>
+          <w:p>
+            <w:pPr>
+              <w:pStyle w:val="Compact"/>
+            </w:pPr>
+            <w:r>
+              <w:t xml:space="preserve">Full Firebase suite on mobile, incl. Cloud Functions</w:t>
+            </w:r>
+          </w:p>
+        </w:tc>
+        <w:tc>
+          <w:tcPr/>
+          <w:p>
+            <w:pPr>
+              <w:pStyle w:val="Compact"/>
+            </w:pPr>
+            <w:r>
+              <w:t xml:space="preserve">narrated video</w:t>
+            </w:r>
+          </w:p>
+        </w:tc>
+      </w:tr>
+      <w:tr>
+        <w:tc>
+          <w:tcPr/>
+          <w:p>
+            <w:pPr>
+              <w:pStyle w:val="Compact"/>
+            </w:pPr>
+            <w:r>
+              <w:rPr>
+                <w:b/>
+                <w:bCs/>
+              </w:rPr>
+              <w:t xml:space="preserve">VR Simulation</w:t>
+            </w:r>
+          </w:p>
+        </w:tc>
+        <w:tc>
+          <w:tcPr/>
+          <w:p>
+            <w:pPr>
+              <w:pStyle w:val="Compact"/>
+            </w:pPr>
+            <w:r>
+              <w:t xml:space="preserve">VR + Virtuix Omni hardware + ML-Agents AI</w:t>
+            </w:r>
+          </w:p>
+        </w:tc>
+        <w:tc>
+          <w:tcPr/>
+          <w:p>
+            <w:pPr>
+              <w:pStyle w:val="Compact"/>
+            </w:pPr>
+            <w:r>
+              <w:t xml:space="preserve">video</w:t>
+            </w:r>
+          </w:p>
+        </w:tc>
+      </w:tr>
+    </w:tbl>
+    <w:p>
+      <w:pPr>
+        <w:pStyle w:val="BodyText"/>
+      </w:pPr>
+      <w:r>
+        <w:rPr>
+          <w:i/>
+          <w:iCs/>
+        </w:rPr>
+        <w:t xml:space="preserve">Below: one page per project. This is a curated selection — happy to share more on request.</w:t>
       </w:r>
     </w:p>
     <w:p>

</xml_diff>